<commit_message>
Prueba de sensibilidad estallido
Prueba de los modelos PACES sin los estudiantes encuestados posterior al estallido social 18-10-2019
</commit_message>
<xml_diff>
--- a/output/Descriptivos/descriptivos_clima_escuela.docx
+++ b/output/Descriptivos/descriptivos_clima_escuela.docx
@@ -277,7 +277,7 @@
               <w:pStyle w:val="Normal"/>
             </w:pPr>
             <w:r>
-              <w:t>64</w:t>
+              <w:t>59</w:t>
             </w:r>
           </w:p>
         </w:tc>
@@ -307,17 +307,17 @@
               <w:pStyle w:val="Normal"/>
             </w:pPr>
             <w:r>
-              <w:t>0.03935327</w:t>
-            </w:r>
-          </w:p>
-        </w:tc>
-        <w:tc>
-          <w:p>
-            <w:pPr>
-              <w:pStyle w:val="Normal"/>
-            </w:pPr>
-            <w:r>
-              <w:t>0.3237902</w:t>
+              <w:t>0.09189246</w:t>
+            </w:r>
+          </w:p>
+        </w:tc>
+        <w:tc>
+          <w:p>
+            <w:pPr>
+              <w:pStyle w:val="Normal"/>
+            </w:pPr>
+            <w:r>
+              <w:t>0.4211994</w:t>
             </w:r>
           </w:p>
         </w:tc>

</xml_diff>